<commit_message>
Documento: agregar espacios etiquetados para capturas y URL del repo
Co-Authored-By: Claude Opus 4.8 (1M context) <noreply@anthropic.com>
</commit_message>
<xml_diff>
--- a/docs/Documentacion-Ecuador-LaTri.docx
+++ b/docs/Documentacion-Ecuador-LaTri.docx
@@ -944,9 +944,105 @@
         <w:rPr>
           <w:sz w:val="22"/>
         </w:rPr>
-        <w:t>[ Pendiente: inserta aquí las capturas reales del Splash, Home y Detalle tomadas desde tu celular con Expo Go antes de entregar. ]</w:t>
+        <w:t>Capturas tomadas desde el celular con la app Expo Go. Para insertar cada imagen: haz clic en el recuadro correspondiente y usa Insertar &gt; Imagen en Word.</w:t>
       </w:r>
     </w:p>
+    <w:p>
+      <w:r>
+        <w:rPr>
+          <w:b/>
+          <w:color w:val="003DA5"/>
+          <w:sz w:val="22"/>
+        </w:rPr>
+        <w:t>Figura 1. Splash Screen</w:t>
+      </w:r>
+    </w:p>
+    <w:p>
+      <w:r>
+        <w:rPr>
+          <w:sz w:val="21"/>
+        </w:rPr>
+        <w:t>Pantalla de bienvenida: escudo de la FEF y el texto "Ecuador - La Tri" sobre fondo azul.</w:t>
+      </w:r>
+    </w:p>
+    <w:p>
+      <w:pPr>
+        <w:jc w:val="center"/>
+      </w:pPr>
+      <w:r>
+        <w:rPr>
+          <w:i/>
+          <w:color w:val="888888"/>
+          <w:sz w:val="20"/>
+        </w:rPr>
+        <w:t>[  Inserta aquí la captura de Splash Screen  ]</w:t>
+      </w:r>
+    </w:p>
+    <w:p/>
+    <w:p>
+      <w:r>
+        <w:rPr>
+          <w:b/>
+          <w:color w:val="003DA5"/>
+          <w:sz w:val="22"/>
+        </w:rPr>
+        <w:t>Figura 2. Home Screen</w:t>
+      </w:r>
+    </w:p>
+    <w:p>
+      <w:r>
+        <w:rPr>
+          <w:sz w:val="21"/>
+        </w:rPr>
+        <w:t>Pantalla principal con el título, el escudo y los seis datos del equipo, además de los dos botones.</w:t>
+      </w:r>
+    </w:p>
+    <w:p>
+      <w:pPr>
+        <w:jc w:val="center"/>
+      </w:pPr>
+      <w:r>
+        <w:rPr>
+          <w:i/>
+          <w:color w:val="888888"/>
+          <w:sz w:val="20"/>
+        </w:rPr>
+        <w:t>[  Inserta aquí la captura de Home Screen  ]</w:t>
+      </w:r>
+    </w:p>
+    <w:p/>
+    <w:p>
+      <w:r>
+        <w:rPr>
+          <w:b/>
+          <w:color w:val="003DA5"/>
+          <w:sz w:val="22"/>
+        </w:rPr>
+        <w:t>Figura 3. Detail Screen</w:t>
+      </w:r>
+    </w:p>
+    <w:p>
+      <w:r>
+        <w:rPr>
+          <w:sz w:val="21"/>
+        </w:rPr>
+        <w:t>Pantalla de detalle con la información de la Selección y el botón que muestra el mensaje (Alert).</w:t>
+      </w:r>
+    </w:p>
+    <w:p>
+      <w:pPr>
+        <w:jc w:val="center"/>
+      </w:pPr>
+      <w:r>
+        <w:rPr>
+          <w:i/>
+          <w:color w:val="888888"/>
+          <w:sz w:val="20"/>
+        </w:rPr>
+        <w:t>[  Inserta aquí la captura de Detail Screen  ]</w:t>
+      </w:r>
+    </w:p>
+    <w:p/>
     <w:p>
       <w:r>
         <w:rPr>
@@ -962,7 +1058,17 @@
         <w:rPr>
           <w:sz w:val="22"/>
         </w:rPr>
-        <w:t>Enlace al repositorio público (GitHub):  [ pega aquí la URL de tu repositorio ]</w:t>
+        <w:t>Enlace al repositorio público en GitHub:</w:t>
+      </w:r>
+    </w:p>
+    <w:p>
+      <w:r>
+        <w:rPr>
+          <w:b/>
+          <w:color w:val="003DA5"/>
+          <w:sz w:val="22"/>
+        </w:rPr>
+        <w:t>https://github.com/CheffoPiu/seleccion-ecuador-app</w:t>
       </w:r>
     </w:p>
     <w:sectPr>

</xml_diff>